<commit_message>
Fill out templates folder with project-specific documentation
</commit_message>
<xml_diff>
--- a/templates/1. Ideation Phase/Define Problem Statements Template.docx
+++ b/templates/1. Ideation Phase/Define Problem Statements Template.docx
@@ -631,80 +631,40 @@
         <w:tc>
           <w:tcPr/>
           <w:p>
-            <w:pPr>
-              <w:rPr>
-                <w:sz w:val="24"/>
-                <w:szCs w:val="24"/>
-              </w:rPr>
-            </w:pPr>
-            <w:r>
-              <w:rPr>
-                <w:rtl w:val="0"/>
-              </w:rPr>
-            </w:r>
-          </w:p>
-        </w:tc>
-        <w:tc>
-          <w:tcPr/>
-          <w:p>
-            <w:pPr>
-              <w:rPr>
-                <w:sz w:val="24"/>
-                <w:szCs w:val="24"/>
-              </w:rPr>
-            </w:pPr>
-            <w:r>
-              <w:rPr>
-                <w:rtl w:val="0"/>
-              </w:rPr>
-            </w:r>
-          </w:p>
-        </w:tc>
-        <w:tc>
-          <w:tcPr/>
-          <w:p>
-            <w:pPr>
-              <w:rPr>
-                <w:sz w:val="24"/>
-                <w:szCs w:val="24"/>
-              </w:rPr>
-            </w:pPr>
-            <w:r>
-              <w:rPr>
-                <w:rtl w:val="0"/>
-              </w:rPr>
-            </w:r>
-          </w:p>
-        </w:tc>
-        <w:tc>
-          <w:tcPr/>
-          <w:p>
-            <w:pPr>
-              <w:rPr>
-                <w:sz w:val="24"/>
-                <w:szCs w:val="24"/>
-              </w:rPr>
-            </w:pPr>
-            <w:r>
-              <w:rPr>
-                <w:rtl w:val="0"/>
-              </w:rPr>
-            </w:r>
-          </w:p>
-        </w:tc>
-        <w:tc>
-          <w:tcPr/>
-          <w:p>
-            <w:pPr>
-              <w:rPr>
-                <w:sz w:val="24"/>
-                <w:szCs w:val="24"/>
-              </w:rPr>
-            </w:pPr>
-            <w:r>
-              <w:rPr>
-                <w:rtl w:val="0"/>
-              </w:rPr>
+            <w:r>
+              <w:t>A pilgrim visiting historical temples in India</w:t>
+            </w:r>
+          </w:p>
+        </w:tc>
+        <w:tc>
+          <w:tcPr/>
+          <w:p>
+            <w:r>
+              <w:t>reserve a secure entry pass/ticket online for a specific time slot</w:t>
+            </w:r>
+          </w:p>
+        </w:tc>
+        <w:tc>
+          <w:tcPr/>
+          <w:p>
+            <w:r>
+              <w:t>I cannot find a reliable portal, face long waiting lines, and don't know remaining capacities</w:t>
+            </w:r>
+          </w:p>
+        </w:tc>
+        <w:tc>
+          <w:tcPr/>
+          <w:p>
+            <w:r>
+              <w:t>temple trusts lack digital scheduling portals, and remote sites face poor internet connectivity</w:t>
+            </w:r>
+          </w:p>
+        </w:tc>
+        <w:tc>
+          <w:tcPr/>
+          <w:p>
+            <w:r>
+              <w:t>anxious, exhausted, and uncertain about my spiritual journey</w:t>
             </w:r>
           </w:p>
         </w:tc>
@@ -736,80 +696,40 @@
         <w:tc>
           <w:tcPr/>
           <w:p>
-            <w:pPr>
-              <w:rPr>
-                <w:sz w:val="24"/>
-                <w:szCs w:val="24"/>
-              </w:rPr>
-            </w:pPr>
-            <w:r>
-              <w:rPr>
-                <w:rtl w:val="0"/>
-              </w:rPr>
-            </w:r>
-          </w:p>
-        </w:tc>
-        <w:tc>
-          <w:tcPr/>
-          <w:p>
-            <w:pPr>
-              <w:rPr>
-                <w:sz w:val="24"/>
-                <w:szCs w:val="24"/>
-              </w:rPr>
-            </w:pPr>
-            <w:r>
-              <w:rPr>
-                <w:rtl w:val="0"/>
-              </w:rPr>
-            </w:r>
-          </w:p>
-        </w:tc>
-        <w:tc>
-          <w:tcPr/>
-          <w:p>
-            <w:pPr>
-              <w:rPr>
-                <w:sz w:val="24"/>
-                <w:szCs w:val="24"/>
-              </w:rPr>
-            </w:pPr>
-            <w:r>
-              <w:rPr>
-                <w:rtl w:val="0"/>
-              </w:rPr>
-            </w:r>
-          </w:p>
-        </w:tc>
-        <w:tc>
-          <w:tcPr/>
-          <w:p>
-            <w:pPr>
-              <w:rPr>
-                <w:sz w:val="24"/>
-                <w:szCs w:val="24"/>
-              </w:rPr>
-            </w:pPr>
-            <w:r>
-              <w:rPr>
-                <w:rtl w:val="0"/>
-              </w:rPr>
-            </w:r>
-          </w:p>
-        </w:tc>
-        <w:tc>
-          <w:tcPr/>
-          <w:p>
-            <w:pPr>
-              <w:rPr>
-                <w:sz w:val="24"/>
-                <w:szCs w:val="24"/>
-              </w:rPr>
-            </w:pPr>
-            <w:r>
-              <w:rPr>
-                <w:rtl w:val="0"/>
-              </w:rPr>
+            <w:r>
+              <w:t>A temple trustee/admin organizer</w:t>
+            </w:r>
+          </w:p>
+        </w:tc>
+        <w:tc>
+          <w:tcPr/>
+          <w:p>
+            <w:r>
+              <w:t>regulate crowd numbers, manage donations, and verify tickets at the gate</w:t>
+            </w:r>
+          </w:p>
+        </w:tc>
+        <w:tc>
+          <w:tcPr/>
+          <w:p>
+            <w:r>
+              <w:t>I have to deal with manual lists, ticket black-marketing, and server outages</w:t>
+            </w:r>
+          </w:p>
+        </w:tc>
+        <w:tc>
+          <w:tcPr/>
+          <w:p>
+            <w:r>
+              <w:t>there is no centralized offline-resilient gate scanning system</w:t>
+            </w:r>
+          </w:p>
+        </w:tc>
+        <w:tc>
+          <w:tcPr/>
+          <w:p>
+            <w:r>
+              <w:t>overwhelmed, stressed, and unable to ensure safety</w:t>
             </w:r>
           </w:p>
         </w:tc>

</xml_diff>